<commit_message>
Revert "release: v1.4.0 — 2026 rate card reprice and pilot project restructure"
</commit_message>
<xml_diff>
--- a/hire/assets/dl/Ryan-Hickey-Resume-Music.docx
+++ b/hire/assets/dl/Ryan-Hickey-Resume-Music.docx
@@ -15,7 +15,7 @@
         <w:pStyle w:val="WPATSRole"/>
       </w:pPr>
       <w:r>
-        <w:t>Applied AI Engineer · Data Engineer · COO · Professional Musician</w:t>
+        <w:t>AI Engineer · Data &amp; AI Systems Architect · COO · Professional Musician</w:t>
       </w:r>
     </w:p>
     <w:p>
@@ -26,7 +26,7 @@
         </w:pBdr>
       </w:pPr>
       <w:r>
-        <w:t>ryan@wolfstrategyllc.com · linkedin.com/in/workwithryan · github.com/wolfpackdata · San Francisco Bay Area</w:t>
+        <w:t>ryan@wolfstrategyllc.com · linkedin.com/in/ryan-hickey-626b2798 · github.com/wolfpackdata · San Francisco Bay Area</w:t>
       </w:r>
     </w:p>
     <w:p>
@@ -46,7 +46,7 @@
         <w:pStyle w:val="WPBody"/>
       </w:pPr>
       <w:r>
-        <w:t>Applied AI engineer, data scientist, software developer, technology operator, and professional musician with 20+ years of coding experience and 17 years leading technology, analytics, and operational initiatives. Combines deep expertise in software architecture, Python development, SQL, cloud analytics, financial modeling, automation, and systems design with modern AI development workflows using Claude Code, OpenAI Codex, ChatGPT, and GitHub Copilot — alongside 36 years at the piano and 23 years paid to perform, spanning studio production, sound design, and professional DJ work since 2009, which makes him a practitioner in the domain rather than a visitor to it.</w:t>
+        <w:t>AI engineer, data scientist, software developer, technology operator, and professional musician with 20+ years of coding experience and 17 years leading technology, analytics, and operational initiatives. Combines deep expertise in software architecture, Python development, SQL, cloud analytics, financial modeling, automation, and systems design with modern AI development workflows using Claude Code, OpenAI Codex, ChatGPT, and GitHub Copilot — alongside 36 years at the piano and 23 years paid to perform, spanning studio production, sound design, and professional DJ work since 2009, which makes him a practitioner in the domain rather than a visitor to it.</w:t>
       </w:r>
     </w:p>
     <w:p>
@@ -176,7 +176,7 @@
               <w:pStyle w:val="WPSkillList"/>
             </w:pPr>
             <w:r>
-              <w:t>Technical Project Leadership · Notion API &amp; Databases · Cross-Functional Team Management · Vendor &amp; Partner Management · Strategic Planning · Operational Scaling · Shopify Plus</w:t>
+              <w:t>Technical Project Leadership · Notion API &amp; Databases · Cross-Functional Team Management · Vendor &amp; Partner Management · Strategic Planning · Operational Scaling</w:t>
             </w:r>
           </w:p>
         </w:tc>
@@ -482,22 +482,6 @@
       </w:r>
       <w:r>
         <w:t>Wrote the company’s proprietary pricing and inventory algorithms in Python and SQL — the systems behind how the catalog was priced and how inventory was bought and held.</w:t>
-      </w:r>
-    </w:p>
-    <w:p>
-      <w:pPr>
-        <w:pStyle w:val="WPBullet"/>
-        <w:keepLines/>
-      </w:pPr>
-      <w:r>
-        <w:rPr>
-          <w:color w:val="6B7186"/>
-        </w:rPr>
-        <w:t>▸</w:t>
-        <w:tab/>
-      </w:r>
-      <w:r>
-        <w:t>Ran the company’s Shopify Plus storefront for 10+ years: commerce platform, dynamic pricing, automated inventory, and fulfillment systems on a custom tech stack (Matrixify, Rithum, GCP, SendGrid).</w:t>
       </w:r>
     </w:p>
     <w:p>

</xml_diff>